<commit_message>
Notes sheet v8: name CFO/CFI/CFF in the cash flow table, one line per row
Co-Authored-By: Claude Opus 5.5 <noreply@anthropic.com>
Claude-Session: https://claude.ai/code/session_01GEFnz4bwrCJKQo1pbVjL4k
</commit_message>
<xml_diff>
--- a/ec1745-midterm-prep/EC1745_Notes_Sheet_v8.docx
+++ b/ec1745-midterm-prep/EC1745_Notes_Sheet_v8.docx
@@ -2493,8 +2493,8 @@
         </w:tblBorders>
       </w:tblPr>
       <w:tblGrid>
-        <w:gridCol w:w="1450"/>
-        <w:gridCol w:w="4094"/>
+        <w:gridCol w:w="1750"/>
+        <w:gridCol w:w="3794"/>
       </w:tblGrid>
       <w:tr>
         <w:trPr>
@@ -2502,7 +2502,7 @@
         </w:trPr>
         <w:tc>
           <w:tcPr>
-            <w:tcW w:type="dxa" w:w="1450"/>
+            <w:tcW w:type="dxa" w:w="1750"/>
             <w:tcBorders>
               <w:top w:val="single" w:color="BFBFBF" w:sz="4"/>
               <w:left w:val="single" w:color="BFBFBF" w:sz="4"/>
@@ -2532,28 +2532,28 @@
         </w:tc>
         <w:tc>
           <w:tcPr>
-            <w:tcW w:type="dxa" w:w="4094"/>
-            <w:tcBorders>
-              <w:top w:val="single" w:color="BFBFBF" w:sz="4"/>
-              <w:left w:val="single" w:color="BFBFBF" w:sz="4"/>
-              <w:bottom w:val="single" w:color="BFBFBF" w:sz="4"/>
-              <w:right w:val="single" w:color="BFBFBF" w:sz="4"/>
-            </w:tcBorders>
-            <w:tcMar>
-              <w:top w:type="dxa" w:w="0"/>
-              <w:left w:type="dxa" w:w="50"/>
-              <w:bottom w:type="dxa" w:w="0"/>
-              <w:right w:type="dxa" w:w="50"/>
-            </w:tcMar>
-          </w:tcPr>
-          <w:p>
-            <w:r>
-              <w:rPr>
-                <w:rFonts w:ascii="Calibri" w:cs="Calibri" w:eastAsia="Calibri" w:hAnsi="Calibri"/>
-                <w:sz w:val="19"/>
-                <w:szCs w:val="19"/>
-              </w:rPr>
-              <w:t xml:space="preserve">ΔNWC = ΔAR + ΔI – ΔAP   (ΔI = Δinventory)</w:t>
+            <w:tcW w:type="dxa" w:w="3794"/>
+            <w:tcBorders>
+              <w:top w:val="single" w:color="BFBFBF" w:sz="4"/>
+              <w:left w:val="single" w:color="BFBFBF" w:sz="4"/>
+              <w:bottom w:val="single" w:color="BFBFBF" w:sz="4"/>
+              <w:right w:val="single" w:color="BFBFBF" w:sz="4"/>
+            </w:tcBorders>
+            <w:tcMar>
+              <w:top w:type="dxa" w:w="0"/>
+              <w:left w:type="dxa" w:w="50"/>
+              <w:bottom w:type="dxa" w:w="0"/>
+              <w:right w:type="dxa" w:w="50"/>
+            </w:tcMar>
+          </w:tcPr>
+          <w:p>
+            <w:r>
+              <w:rPr>
+                <w:rFonts w:ascii="Calibri" w:cs="Calibri" w:eastAsia="Calibri" w:hAnsi="Calibri"/>
+                <w:sz w:val="19"/>
+                <w:szCs w:val="19"/>
+              </w:rPr>
+              <w:t xml:space="preserve">ΔNWC = ΔAR + ΔI – ΔAP  (ΔI = Δinventory)</w:t>
             </w:r>
           </w:p>
         </w:tc>
@@ -2564,7 +2564,7 @@
         </w:trPr>
         <w:tc>
           <w:tcPr>
-            <w:tcW w:type="dxa" w:w="1450"/>
+            <w:tcW w:type="dxa" w:w="1750"/>
             <w:tcBorders>
               <w:top w:val="single" w:color="BFBFBF" w:sz="4"/>
               <w:left w:val="single" w:color="BFBFBF" w:sz="4"/>
@@ -2590,11 +2590,19 @@
               </w:rPr>
               <w:t xml:space="preserve">2. CFO</w:t>
             </w:r>
-          </w:p>
-        </w:tc>
-        <w:tc>
-          <w:tcPr>
-            <w:tcW w:type="dxa" w:w="4094"/>
+            <w:r>
+              <w:rPr>
+                <w:rFonts w:ascii="Calibri" w:cs="Calibri" w:eastAsia="Calibri" w:hAnsi="Calibri"/>
+                <w:sz w:val="19"/>
+                <w:szCs w:val="19"/>
+              </w:rPr>
+              <w:t xml:space="preserve"> (operations)</w:t>
+            </w:r>
+          </w:p>
+        </w:tc>
+        <w:tc>
+          <w:tcPr>
+            <w:tcW w:type="dxa" w:w="3794"/>
             <w:tcBorders>
               <w:top w:val="single" w:color="BFBFBF" w:sz="4"/>
               <w:left w:val="single" w:color="BFBFBF" w:sz="4"/>
@@ -2626,7 +2634,7 @@
         </w:trPr>
         <w:tc>
           <w:tcPr>
-            <w:tcW w:type="dxa" w:w="1450"/>
+            <w:tcW w:type="dxa" w:w="1750"/>
             <w:tcBorders>
               <w:top w:val="single" w:color="BFBFBF" w:sz="4"/>
               <w:left w:val="single" w:color="BFBFBF" w:sz="4"/>
@@ -2656,7 +2664,7 @@
         </w:tc>
         <w:tc>
           <w:tcPr>
-            <w:tcW w:type="dxa" w:w="4094"/>
+            <w:tcW w:type="dxa" w:w="3794"/>
             <w:tcBorders>
               <w:top w:val="single" w:color="BFBFBF" w:sz="4"/>
               <w:left w:val="single" w:color="BFBFBF" w:sz="4"/>
@@ -2688,7 +2696,7 @@
         </w:trPr>
         <w:tc>
           <w:tcPr>
-            <w:tcW w:type="dxa" w:w="1450"/>
+            <w:tcW w:type="dxa" w:w="1750"/>
             <w:tcBorders>
               <w:top w:val="single" w:color="BFBFBF" w:sz="4"/>
               <w:left w:val="single" w:color="BFBFBF" w:sz="4"/>
@@ -2714,11 +2722,19 @@
               </w:rPr>
               <w:t xml:space="preserve">4. CFI</w:t>
             </w:r>
-          </w:p>
-        </w:tc>
-        <w:tc>
-          <w:tcPr>
-            <w:tcW w:type="dxa" w:w="4094"/>
+            <w:r>
+              <w:rPr>
+                <w:rFonts w:ascii="Calibri" w:cs="Calibri" w:eastAsia="Calibri" w:hAnsi="Calibri"/>
+                <w:sz w:val="19"/>
+                <w:szCs w:val="19"/>
+              </w:rPr>
+              <w:t xml:space="preserve"> (investing)</w:t>
+            </w:r>
+          </w:p>
+        </w:tc>
+        <w:tc>
+          <w:tcPr>
+            <w:tcW w:type="dxa" w:w="3794"/>
             <w:tcBorders>
               <w:top w:val="single" w:color="BFBFBF" w:sz="4"/>
               <w:left w:val="single" w:color="BFBFBF" w:sz="4"/>
@@ -2750,7 +2766,7 @@
         </w:trPr>
         <w:tc>
           <w:tcPr>
-            <w:tcW w:type="dxa" w:w="1450"/>
+            <w:tcW w:type="dxa" w:w="1750"/>
             <w:tcBorders>
               <w:top w:val="single" w:color="BFBFBF" w:sz="4"/>
               <w:left w:val="single" w:color="BFBFBF" w:sz="4"/>
@@ -2776,32 +2792,40 @@
               </w:rPr>
               <w:t xml:space="preserve">5. CFF</w:t>
             </w:r>
-          </w:p>
-        </w:tc>
-        <w:tc>
-          <w:tcPr>
-            <w:tcW w:type="dxa" w:w="4094"/>
-            <w:tcBorders>
-              <w:top w:val="single" w:color="BFBFBF" w:sz="4"/>
-              <w:left w:val="single" w:color="BFBFBF" w:sz="4"/>
-              <w:bottom w:val="single" w:color="BFBFBF" w:sz="4"/>
-              <w:right w:val="single" w:color="BFBFBF" w:sz="4"/>
-            </w:tcBorders>
-            <w:tcMar>
-              <w:top w:type="dxa" w:w="0"/>
-              <w:left w:type="dxa" w:w="50"/>
-              <w:bottom w:type="dxa" w:w="0"/>
-              <w:right w:type="dxa" w:w="50"/>
-            </w:tcMar>
-          </w:tcPr>
-          <w:p>
-            <w:r>
-              <w:rPr>
-                <w:rFonts w:ascii="Calibri" w:cs="Calibri" w:eastAsia="Calibri" w:hAnsi="Calibri"/>
-                <w:sz w:val="19"/>
-                <w:szCs w:val="19"/>
-              </w:rPr>
-              <w:t xml:space="preserve">CFF = New debt (ΔDebt) + new stock – dividends</w:t>
+            <w:r>
+              <w:rPr>
+                <w:rFonts w:ascii="Calibri" w:cs="Calibri" w:eastAsia="Calibri" w:hAnsi="Calibri"/>
+                <w:sz w:val="19"/>
+                <w:szCs w:val="19"/>
+              </w:rPr>
+              <w:t xml:space="preserve"> (financing)</w:t>
+            </w:r>
+          </w:p>
+        </w:tc>
+        <w:tc>
+          <w:tcPr>
+            <w:tcW w:type="dxa" w:w="3794"/>
+            <w:tcBorders>
+              <w:top w:val="single" w:color="BFBFBF" w:sz="4"/>
+              <w:left w:val="single" w:color="BFBFBF" w:sz="4"/>
+              <w:bottom w:val="single" w:color="BFBFBF" w:sz="4"/>
+              <w:right w:val="single" w:color="BFBFBF" w:sz="4"/>
+            </w:tcBorders>
+            <w:tcMar>
+              <w:top w:type="dxa" w:w="0"/>
+              <w:left w:type="dxa" w:w="50"/>
+              <w:bottom w:type="dxa" w:w="0"/>
+              <w:right w:type="dxa" w:w="50"/>
+            </w:tcMar>
+          </w:tcPr>
+          <w:p>
+            <w:r>
+              <w:rPr>
+                <w:rFonts w:ascii="Calibri" w:cs="Calibri" w:eastAsia="Calibri" w:hAnsi="Calibri"/>
+                <w:sz w:val="19"/>
+                <w:szCs w:val="19"/>
+              </w:rPr>
+              <w:t xml:space="preserve">CFF = ΔDebt + new stock – dividends</w:t>
             </w:r>
           </w:p>
         </w:tc>
@@ -2812,7 +2836,7 @@
         </w:trPr>
         <w:tc>
           <w:tcPr>
-            <w:tcW w:type="dxa" w:w="1450"/>
+            <w:tcW w:type="dxa" w:w="1750"/>
             <w:tcBorders>
               <w:top w:val="single" w:color="BFBFBF" w:sz="4"/>
               <w:left w:val="single" w:color="BFBFBF" w:sz="4"/>
@@ -2838,11 +2862,19 @@
               </w:rPr>
               <w:t xml:space="preserve">6. Check</w:t>
             </w:r>
-          </w:p>
-        </w:tc>
-        <w:tc>
-          <w:tcPr>
-            <w:tcW w:type="dxa" w:w="4094"/>
+            <w:r>
+              <w:rPr>
+                <w:rFonts w:ascii="Calibri" w:cs="Calibri" w:eastAsia="Calibri" w:hAnsi="Calibri"/>
+                <w:sz w:val="19"/>
+                <w:szCs w:val="19"/>
+              </w:rPr>
+              <w:t xml:space="preserve"> (vs. BS)</w:t>
+            </w:r>
+          </w:p>
+        </w:tc>
+        <w:tc>
+          <w:tcPr>
+            <w:tcW w:type="dxa" w:w="3794"/>
             <w:tcBorders>
               <w:top w:val="single" w:color="BFBFBF" w:sz="4"/>
               <w:left w:val="single" w:color="BFBFBF" w:sz="4"/>
@@ -2873,7 +2905,7 @@
                 <w:sz w:val="19"/>
                 <w:szCs w:val="19"/>
               </w:rPr>
-              <w:t xml:space="preserve"> (balance sheet) ✓</w:t>
+              <w:t xml:space="preserve"> ✓</w:t>
             </w:r>
           </w:p>
         </w:tc>

</xml_diff>